<commit_message>
Initial commit: sistem antrian berbasis microservices
</commit_message>
<xml_diff>
--- a/dokumen/Sistem Informasi Antrian Posyandu Berbasis Microservis.docx
+++ b/dokumen/Sistem Informasi Antrian Posyandu Berbasis Microservis.docx
@@ -152,11 +152,25 @@
     </w:p>
     <w:p>
       <w:pPr>
-        <w:spacing w:after="360" w:line="360" w:lineRule="auto"/>
+        <w:spacing w:after="360"/>
         <w:jc w:val="center"/>
       </w:pPr>
       <w:r>
         <w:t>Disusun oleh:</w:t>
+      </w:r>
+    </w:p>
+    <w:p>
+      <w:pPr>
+        <w:pStyle w:val="ListParagraph"/>
+        <w:numPr>
+          <w:ilvl w:val="0"/>
+          <w:numId w:val="1"/>
+        </w:numPr>
+        <w:spacing w:after="360"/>
+        <w:jc w:val="center"/>
+      </w:pPr>
+      <w:r>
+        <w:t>Juwita Sara Safitri (24260006)</w:t>
       </w:r>
     </w:p>
     <w:p>
@@ -170,29 +184,6 @@
         <w:jc w:val="center"/>
       </w:pPr>
       <w:r>
-        <w:t xml:space="preserve">Juwita Sara Safitri </w:t>
-      </w:r>
-      <w:r>
-        <w:t>(</w:t>
-      </w:r>
-      <w:r>
-        <w:t>24260006</w:t>
-      </w:r>
-      <w:r>
-        <w:t>)</w:t>
-      </w:r>
-    </w:p>
-    <w:p>
-      <w:pPr>
-        <w:pStyle w:val="ListParagraph"/>
-        <w:numPr>
-          <w:ilvl w:val="0"/>
-          <w:numId w:val="1"/>
-        </w:numPr>
-        <w:spacing w:after="360" w:line="360" w:lineRule="auto"/>
-        <w:jc w:val="center"/>
-      </w:pPr>
-      <w:r>
         <w:t>Khoerul Akbar (</w:t>
       </w:r>
       <w:r>
@@ -257,6 +248,10 @@
       <w:pPr>
         <w:spacing w:after="20" w:line="360" w:lineRule="auto"/>
         <w:jc w:val="center"/>
+        <w:rPr>
+          <w:b/>
+          <w:bCs/>
+        </w:rPr>
       </w:pPr>
       <w:r>
         <w:rPr>
@@ -268,6 +263,13 @@
     </w:p>
     <w:p>
       <w:pPr>
+        <w:spacing w:after="20" w:line="360" w:lineRule="auto"/>
+        <w:jc w:val="center"/>
+      </w:pPr>
+    </w:p>
+    <w:p>
+      <w:pPr>
+        <w:spacing w:line="276" w:lineRule="auto"/>
         <w:jc w:val="center"/>
         <w:rPr>
           <w:b/>
@@ -287,7 +289,7 @@
     </w:p>
     <w:p>
       <w:pPr>
-        <w:spacing w:line="360" w:lineRule="auto"/>
+        <w:spacing w:line="276" w:lineRule="auto"/>
         <w:jc w:val="center"/>
         <w:rPr>
           <w:b/>
@@ -297,7 +299,7 @@
     </w:p>
     <w:p>
       <w:pPr>
-        <w:spacing w:line="360" w:lineRule="auto"/>
+        <w:spacing w:line="276" w:lineRule="auto"/>
         <w:jc w:val="both"/>
       </w:pPr>
       <w:r>
@@ -466,13 +468,13 @@
     </w:p>
     <w:p>
       <w:pPr>
-        <w:spacing w:line="360" w:lineRule="auto"/>
+        <w:spacing w:line="276" w:lineRule="auto"/>
         <w:jc w:val="both"/>
       </w:pPr>
     </w:p>
     <w:p>
       <w:pPr>
-        <w:spacing w:line="360" w:lineRule="auto"/>
+        <w:spacing w:line="276" w:lineRule="auto"/>
         <w:jc w:val="both"/>
         <w:rPr>
           <w:i/>
@@ -540,7 +542,7 @@
     </w:p>
     <w:p>
       <w:pPr>
-        <w:spacing w:line="360" w:lineRule="auto"/>
+        <w:spacing w:line="276" w:lineRule="auto"/>
         <w:jc w:val="both"/>
         <w:rPr>
           <w:i/>
@@ -550,7 +552,7 @@
     </w:p>
     <w:p>
       <w:pPr>
-        <w:spacing w:line="360" w:lineRule="auto"/>
+        <w:spacing w:line="276" w:lineRule="auto"/>
         <w:jc w:val="both"/>
         <w:rPr>
           <w:i/>
@@ -560,7 +562,7 @@
     </w:p>
     <w:p>
       <w:pPr>
-        <w:spacing w:line="360" w:lineRule="auto"/>
+        <w:spacing w:line="276" w:lineRule="auto"/>
         <w:jc w:val="both"/>
         <w:rPr>
           <w:i/>
@@ -570,7 +572,7 @@
     </w:p>
     <w:p>
       <w:pPr>
-        <w:spacing w:line="360" w:lineRule="auto"/>
+        <w:spacing w:line="276" w:lineRule="auto"/>
         <w:jc w:val="both"/>
         <w:rPr>
           <w:i/>
@@ -580,7 +582,7 @@
     </w:p>
     <w:p>
       <w:pPr>
-        <w:spacing w:line="360" w:lineRule="auto"/>
+        <w:spacing w:line="276" w:lineRule="auto"/>
         <w:jc w:val="both"/>
         <w:rPr>
           <w:i/>
@@ -590,7 +592,7 @@
     </w:p>
     <w:p>
       <w:pPr>
-        <w:spacing w:line="360" w:lineRule="auto"/>
+        <w:spacing w:line="276" w:lineRule="auto"/>
         <w:jc w:val="both"/>
         <w:rPr>
           <w:i/>
@@ -600,7 +602,7 @@
     </w:p>
     <w:p>
       <w:pPr>
-        <w:spacing w:line="360" w:lineRule="auto"/>
+        <w:spacing w:line="276" w:lineRule="auto"/>
         <w:jc w:val="both"/>
         <w:rPr>
           <w:i/>
@@ -610,7 +612,7 @@
     </w:p>
     <w:p>
       <w:pPr>
-        <w:spacing w:line="360" w:lineRule="auto"/>
+        <w:spacing w:line="276" w:lineRule="auto"/>
         <w:jc w:val="both"/>
         <w:rPr>
           <w:i/>
@@ -620,7 +622,7 @@
     </w:p>
     <w:p>
       <w:pPr>
-        <w:spacing w:line="360" w:lineRule="auto"/>
+        <w:spacing w:line="276" w:lineRule="auto"/>
         <w:jc w:val="both"/>
         <w:rPr>
           <w:i/>
@@ -630,7 +632,7 @@
     </w:p>
     <w:p>
       <w:pPr>
-        <w:spacing w:line="360" w:lineRule="auto"/>
+        <w:spacing w:line="276" w:lineRule="auto"/>
         <w:jc w:val="both"/>
         <w:rPr>
           <w:i/>
@@ -640,7 +642,7 @@
     </w:p>
     <w:p>
       <w:pPr>
-        <w:spacing w:line="360" w:lineRule="auto"/>
+        <w:spacing w:line="276" w:lineRule="auto"/>
         <w:jc w:val="both"/>
         <w:rPr>
           <w:i/>
@@ -650,39 +652,95 @@
     </w:p>
     <w:p>
       <w:pPr>
-        <w:spacing w:line="360" w:lineRule="auto"/>
+        <w:pStyle w:val="ListParagraph"/>
+        <w:keepNext/>
+        <w:numPr>
+          <w:ilvl w:val="0"/>
+          <w:numId w:val="4"/>
+        </w:numPr>
+        <w:spacing w:before="200" w:after="140" w:line="276" w:lineRule="auto"/>
+        <w:rPr>
+          <w:b/>
+          <w:bCs/>
+        </w:rPr>
+      </w:pPr>
+      <w:r>
+        <w:rPr>
+          <w:b/>
+          <w:bCs/>
+        </w:rPr>
+        <w:lastRenderedPageBreak/>
+        <w:t>Arsitektur Sistem</w:t>
+      </w:r>
+    </w:p>
+    <w:p>
+      <w:pPr>
+        <w:pStyle w:val="ListParagraph"/>
+        <w:keepNext/>
+        <w:spacing w:before="200" w:after="140" w:line="276" w:lineRule="auto"/>
+        <w:ind w:left="360" w:firstLine="360"/>
         <w:jc w:val="both"/>
         <w:rPr>
           <w:b/>
           <w:bCs/>
         </w:rPr>
       </w:pPr>
-      <w:r>
-        <w:rPr>
-          <w:b/>
-          <w:bCs/>
-        </w:rPr>
-        <w:lastRenderedPageBreak/>
-        <w:t>Gambar Rancangan Arsitektur</w:t>
-      </w:r>
-    </w:p>
-    <w:p>
-      <w:pPr>
-        <w:spacing w:line="360" w:lineRule="auto"/>
-        <w:jc w:val="both"/>
-      </w:pPr>
-    </w:p>
-    <w:p>
-      <w:pPr>
-        <w:spacing w:line="360" w:lineRule="auto"/>
-        <w:jc w:val="both"/>
-      </w:pPr>
-      <w:r>
+      <w:proofErr w:type="spellStart"/>
+      <w:r>
+        <w:t>Frontend</w:t>
+      </w:r>
+      <w:proofErr w:type="spellEnd"/>
+      <w:r>
+        <w:t xml:space="preserve"> hanya berkomunikasi dengan API </w:t>
+      </w:r>
+      <w:proofErr w:type="spellStart"/>
+      <w:r>
+        <w:t>gateway</w:t>
+      </w:r>
+      <w:proofErr w:type="spellEnd"/>
+      <w:r>
+        <w:t xml:space="preserve">. </w:t>
+      </w:r>
+      <w:proofErr w:type="spellStart"/>
+      <w:r>
+        <w:t>Gateway</w:t>
+      </w:r>
+      <w:proofErr w:type="spellEnd"/>
+      <w:r>
+        <w:t xml:space="preserve"> memverifikasi </w:t>
+      </w:r>
+      <w:proofErr w:type="spellStart"/>
+      <w:r>
+        <w:t>token</w:t>
+      </w:r>
+      <w:proofErr w:type="spellEnd"/>
+      <w:r>
+        <w:t xml:space="preserve"> JWT dan </w:t>
+      </w:r>
+      <w:proofErr w:type="spellStart"/>
+      <w:r>
+        <w:t>role</w:t>
+      </w:r>
+      <w:proofErr w:type="spellEnd"/>
+      <w:r>
+        <w:t>, lalu meneruskan permintaan ke layanan yang sesuai. Setiap layanan memiliki basis data sendiri.</w:t>
+      </w:r>
+    </w:p>
+    <w:p>
+      <w:pPr>
+        <w:keepNext/>
+        <w:spacing w:after="60" w:line="276" w:lineRule="auto"/>
+        <w:jc w:val="center"/>
+      </w:pPr>
+      <w:r>
+        <w:rPr>
+          <w:noProof/>
+        </w:rPr>
         <w:drawing>
-          <wp:inline distT="0" distB="0" distL="0" distR="0" wp14:anchorId="4CC3630F" wp14:editId="7EBC1215">
-            <wp:extent cx="5524500" cy="3857625"/>
-            <wp:effectExtent l="0" t="0" r="0" b="0"/>
-            <wp:docPr id="1" name="arsitektur" descr="Arsitektur microservice sistem antrian Posyandu" title="Arsitektur"/>
+          <wp:inline distT="0" distB="0" distL="0" distR="0" wp14:anchorId="589F474B" wp14:editId="5D758C1C">
+            <wp:extent cx="4826919" cy="3370521"/>
+            <wp:effectExtent l="0" t="0" r="0" b="1905"/>
+            <wp:docPr id="1" name="Arsitektur" descr="Gambar 1. Arsitektur microservice sistem antrian Posyandu" title="Arsitektur"/>
             <wp:cNvGraphicFramePr>
               <a:graphicFrameLocks xmlns:a="http://schemas.openxmlformats.org/drawingml/2006/main" noChangeAspect="1"/>
             </wp:cNvGraphicFramePr>
@@ -705,7 +763,7 @@
                   <pic:spPr bwMode="auto">
                     <a:xfrm>
                       <a:off x="0" y="0"/>
-                      <a:ext cx="5524500" cy="3857625"/>
+                      <a:ext cx="4835105" cy="3376237"/>
                     </a:xfrm>
                     <a:prstGeom prst="rect">
                       <a:avLst/>
@@ -720,12 +778,8 @@
     </w:p>
     <w:p>
       <w:pPr>
-        <w:spacing w:line="360" w:lineRule="auto"/>
+        <w:spacing w:after="200" w:line="276" w:lineRule="auto"/>
         <w:jc w:val="center"/>
-        <w:rPr>
-          <w:i/>
-          <w:iCs/>
-        </w:rPr>
       </w:pPr>
       <w:r>
         <w:rPr>
@@ -769,30 +823,13 @@
     </w:p>
     <w:p>
       <w:pPr>
-        <w:spacing w:line="360" w:lineRule="auto"/>
-        <w:jc w:val="center"/>
-      </w:pPr>
-    </w:p>
-    <w:p>
-      <w:pPr>
-        <w:spacing w:line="360" w:lineRule="auto"/>
-        <w:jc w:val="both"/>
-      </w:pPr>
-      <w:r>
-        <w:rPr>
-          <w:b/>
-          <w:bCs/>
-        </w:rPr>
-        <w:t>Keterangan:</w:t>
-      </w:r>
-    </w:p>
-    <w:p>
-      <w:pPr>
+        <w:pStyle w:val="ListParagraph"/>
         <w:numPr>
           <w:ilvl w:val="0"/>
-          <w:numId w:val="2"/>
+          <w:numId w:val="3"/>
         </w:numPr>
-        <w:spacing w:line="360" w:lineRule="auto"/>
+        <w:spacing w:after="80" w:line="276" w:lineRule="auto"/>
+        <w:contextualSpacing w:val="0"/>
         <w:jc w:val="both"/>
       </w:pPr>
       <w:proofErr w:type="spellStart"/>
@@ -801,7 +838,23 @@
           <w:b/>
           <w:bCs/>
         </w:rPr>
-        <w:t>Frontend</w:t>
+        <w:t>Auth</w:t>
+      </w:r>
+      <w:proofErr w:type="spellEnd"/>
+      <w:r>
+        <w:rPr>
+          <w:b/>
+          <w:bCs/>
+        </w:rPr>
+        <w:t xml:space="preserve"> </w:t>
+      </w:r>
+      <w:proofErr w:type="spellStart"/>
+      <w:r>
+        <w:rPr>
+          <w:b/>
+          <w:bCs/>
+        </w:rPr>
+        <w:t>service</w:t>
       </w:r>
       <w:proofErr w:type="spellEnd"/>
       <w:r>
@@ -812,19 +865,11 @@
         <w:t xml:space="preserve">: </w:t>
       </w:r>
       <w:r>
-        <w:t xml:space="preserve">antarmuka web untuk ambil nomor </w:t>
-      </w:r>
-      <w:proofErr w:type="spellStart"/>
-      <w:r>
-        <w:t>antrian</w:t>
-      </w:r>
-      <w:proofErr w:type="spellEnd"/>
-      <w:r>
-        <w:t xml:space="preserve">, layar </w:t>
-      </w:r>
-      <w:proofErr w:type="spellStart"/>
-      <w:r>
-        <w:t>display</w:t>
+        <w:t xml:space="preserve">mengelola </w:t>
+      </w:r>
+      <w:proofErr w:type="spellStart"/>
+      <w:r>
+        <w:t>login</w:t>
       </w:r>
       <w:proofErr w:type="spellEnd"/>
       <w:r>
@@ -832,52 +877,55 @@
       </w:r>
       <w:proofErr w:type="spellStart"/>
       <w:r>
-        <w:t>login</w:t>
-      </w:r>
-      <w:proofErr w:type="spellEnd"/>
-      <w:r>
-        <w:t xml:space="preserve">, </w:t>
-      </w:r>
-      <w:proofErr w:type="spellStart"/>
-      <w:r>
-        <w:t>dashboard</w:t>
-      </w:r>
-      <w:proofErr w:type="spellEnd"/>
-      <w:r>
-        <w:t xml:space="preserve"> petugas, dan </w:t>
-      </w:r>
-      <w:proofErr w:type="spellStart"/>
-      <w:r>
-        <w:t>dashboard</w:t>
-      </w:r>
-      <w:proofErr w:type="spellEnd"/>
-      <w:r>
-        <w:t xml:space="preserve"> admin.</w:t>
-      </w:r>
-    </w:p>
-    <w:p>
-      <w:pPr>
+        <w:t>token</w:t>
+      </w:r>
+      <w:proofErr w:type="spellEnd"/>
+      <w:r>
+        <w:t xml:space="preserve"> JWT, dan </w:t>
+      </w:r>
+      <w:proofErr w:type="spellStart"/>
+      <w:r>
+        <w:t>role</w:t>
+      </w:r>
+      <w:proofErr w:type="spellEnd"/>
+      <w:r>
+        <w:t xml:space="preserve"> pengguna (admin dan petugas).</w:t>
+      </w:r>
+    </w:p>
+    <w:p>
+      <w:pPr>
+        <w:pStyle w:val="ListParagraph"/>
         <w:numPr>
           <w:ilvl w:val="0"/>
-          <w:numId w:val="2"/>
+          <w:numId w:val="3"/>
         </w:numPr>
-        <w:spacing w:line="360" w:lineRule="auto"/>
+        <w:spacing w:after="80" w:line="276" w:lineRule="auto"/>
+        <w:contextualSpacing w:val="0"/>
         <w:jc w:val="both"/>
       </w:pPr>
-      <w:r>
-        <w:rPr>
-          <w:b/>
-          <w:bCs/>
-        </w:rPr>
-        <w:t xml:space="preserve">API </w:t>
-      </w:r>
-      <w:proofErr w:type="spellStart"/>
-      <w:r>
-        <w:rPr>
-          <w:b/>
-          <w:bCs/>
-        </w:rPr>
-        <w:t>gateway</w:t>
+      <w:proofErr w:type="spellStart"/>
+      <w:r>
+        <w:rPr>
+          <w:b/>
+          <w:bCs/>
+        </w:rPr>
+        <w:t>Antrian</w:t>
+      </w:r>
+      <w:proofErr w:type="spellEnd"/>
+      <w:r>
+        <w:rPr>
+          <w:b/>
+          <w:bCs/>
+        </w:rPr>
+        <w:t xml:space="preserve"> </w:t>
+      </w:r>
+      <w:proofErr w:type="spellStart"/>
+      <w:r>
+        <w:rPr>
+          <w:b/>
+          <w:bCs/>
+        </w:rPr>
+        <w:t>service</w:t>
       </w:r>
       <w:proofErr w:type="spellEnd"/>
       <w:r>
@@ -888,49 +936,42 @@
         <w:t xml:space="preserve">: </w:t>
       </w:r>
       <w:r>
-        <w:t xml:space="preserve">pintu masuk tunggal yang memverifikasi </w:t>
-      </w:r>
-      <w:proofErr w:type="spellStart"/>
-      <w:r>
-        <w:t>token</w:t>
-      </w:r>
-      <w:proofErr w:type="spellEnd"/>
-      <w:r>
-        <w:t xml:space="preserve"> JWT dan meneruskan permintaan ke </w:t>
-      </w:r>
-      <w:proofErr w:type="spellStart"/>
-      <w:r>
-        <w:t>service</w:t>
-      </w:r>
-      <w:proofErr w:type="spellEnd"/>
-      <w:r>
-        <w:t xml:space="preserve"> terkait.</w:t>
-      </w:r>
-    </w:p>
-    <w:p>
-      <w:pPr>
+        <w:t xml:space="preserve">mengelola layanan, pengambilan nomor, pemanggilan, penyelesaian </w:t>
+      </w:r>
+      <w:proofErr w:type="spellStart"/>
+      <w:r>
+        <w:t>antrian</w:t>
+      </w:r>
+      <w:proofErr w:type="spellEnd"/>
+      <w:r>
+        <w:t xml:space="preserve">, dan data layar </w:t>
+      </w:r>
+      <w:proofErr w:type="spellStart"/>
+      <w:r>
+        <w:t>display</w:t>
+      </w:r>
+      <w:proofErr w:type="spellEnd"/>
+      <w:r>
+        <w:t>.</w:t>
+      </w:r>
+    </w:p>
+    <w:p>
+      <w:pPr>
+        <w:pStyle w:val="ListParagraph"/>
         <w:numPr>
           <w:ilvl w:val="0"/>
-          <w:numId w:val="2"/>
+          <w:numId w:val="3"/>
         </w:numPr>
-        <w:spacing w:line="360" w:lineRule="auto"/>
+        <w:spacing w:after="80" w:line="276" w:lineRule="auto"/>
+        <w:contextualSpacing w:val="0"/>
         <w:jc w:val="both"/>
       </w:pPr>
-      <w:proofErr w:type="spellStart"/>
-      <w:r>
-        <w:rPr>
-          <w:b/>
-          <w:bCs/>
-        </w:rPr>
-        <w:t>Auth</w:t>
-      </w:r>
-      <w:proofErr w:type="spellEnd"/>
-      <w:r>
-        <w:rPr>
-          <w:b/>
-          <w:bCs/>
-        </w:rPr>
-        <w:t xml:space="preserve"> </w:t>
+      <w:r>
+        <w:rPr>
+          <w:b/>
+          <w:bCs/>
+        </w:rPr>
+        <w:t xml:space="preserve">Pasien </w:t>
       </w:r>
       <w:proofErr w:type="spellStart"/>
       <w:r>
@@ -949,101 +990,189 @@
         <w:t xml:space="preserve">: </w:t>
       </w:r>
       <w:r>
-        <w:t xml:space="preserve">mengelola </w:t>
-      </w:r>
-      <w:proofErr w:type="spellStart"/>
-      <w:r>
-        <w:t>login</w:t>
-      </w:r>
-      <w:proofErr w:type="spellEnd"/>
-      <w:r>
-        <w:t xml:space="preserve">, </w:t>
-      </w:r>
-      <w:proofErr w:type="spellStart"/>
-      <w:r>
-        <w:t>token</w:t>
-      </w:r>
-      <w:proofErr w:type="spellEnd"/>
-      <w:r>
-        <w:t xml:space="preserve"> JWT, dan </w:t>
-      </w:r>
-      <w:proofErr w:type="spellStart"/>
-      <w:r>
-        <w:t>role</w:t>
-      </w:r>
-      <w:proofErr w:type="spellEnd"/>
-      <w:r>
-        <w:t xml:space="preserve"> pengguna (admin dan petugas).</w:t>
-      </w:r>
-    </w:p>
-    <w:p>
-      <w:pPr>
+        <w:t>mengelola data balita, ibu hamil, kunjungan, serta statistik.</w:t>
+      </w:r>
+    </w:p>
+    <w:p>
+      <w:pPr>
+        <w:spacing w:line="276" w:lineRule="auto"/>
+      </w:pPr>
+      <w:r>
+        <w:br w:type="page"/>
+      </w:r>
+    </w:p>
+    <w:p>
+      <w:pPr>
+        <w:pStyle w:val="ListParagraph"/>
+        <w:keepNext/>
         <w:numPr>
           <w:ilvl w:val="0"/>
-          <w:numId w:val="2"/>
+          <w:numId w:val="4"/>
         </w:numPr>
-        <w:spacing w:line="360" w:lineRule="auto"/>
+        <w:spacing w:before="200" w:after="140" w:line="276" w:lineRule="auto"/>
         <w:jc w:val="both"/>
-      </w:pPr>
-      <w:proofErr w:type="spellStart"/>
-      <w:r>
-        <w:rPr>
-          <w:b/>
-          <w:bCs/>
-        </w:rPr>
-        <w:t>Antrian</w:t>
-      </w:r>
-      <w:proofErr w:type="spellEnd"/>
-      <w:r>
-        <w:rPr>
-          <w:b/>
-          <w:bCs/>
-        </w:rPr>
-        <w:t xml:space="preserve"> </w:t>
-      </w:r>
-      <w:proofErr w:type="spellStart"/>
-      <w:r>
-        <w:rPr>
-          <w:b/>
-          <w:bCs/>
-        </w:rPr>
-        <w:t>service</w:t>
-      </w:r>
-      <w:proofErr w:type="spellEnd"/>
-      <w:r>
-        <w:rPr>
-          <w:b/>
-          <w:bCs/>
-        </w:rPr>
-        <w:t xml:space="preserve">: </w:t>
-      </w:r>
-      <w:r>
-        <w:t xml:space="preserve">mengelola layanan, pengambilan nomor, pemanggilan, penyelesaian </w:t>
-      </w:r>
-      <w:proofErr w:type="spellStart"/>
-      <w:r>
+        <w:rPr>
+          <w:b/>
+          <w:bCs/>
+        </w:rPr>
+      </w:pPr>
+      <w:r>
+        <w:rPr>
+          <w:b/>
+          <w:bCs/>
+        </w:rPr>
+        <w:lastRenderedPageBreak/>
+        <w:t xml:space="preserve">Use </w:t>
+      </w:r>
+      <w:proofErr w:type="spellStart"/>
+      <w:r>
+        <w:rPr>
+          <w:b/>
+          <w:bCs/>
+        </w:rPr>
+        <w:t>Case</w:t>
+      </w:r>
+      <w:proofErr w:type="spellEnd"/>
+      <w:r>
+        <w:rPr>
+          <w:b/>
+          <w:bCs/>
+        </w:rPr>
+        <w:t xml:space="preserve"> Diagram</w:t>
+      </w:r>
+    </w:p>
+    <w:p>
+      <w:pPr>
+        <w:pStyle w:val="ListParagraph"/>
+        <w:keepNext/>
+        <w:spacing w:before="200" w:after="140" w:line="276" w:lineRule="auto"/>
+        <w:ind w:left="360" w:firstLine="360"/>
+        <w:jc w:val="both"/>
+      </w:pPr>
+      <w:r>
+        <w:t xml:space="preserve">Terdapat tiga aktor. Pasien dapat menggunakan sistem tanpa </w:t>
+      </w:r>
+      <w:proofErr w:type="spellStart"/>
+      <w:r>
+        <w:t>login</w:t>
+      </w:r>
+      <w:proofErr w:type="spellEnd"/>
+      <w:r>
+        <w:t xml:space="preserve">. Petugas dan admin wajib </w:t>
+      </w:r>
+      <w:proofErr w:type="spellStart"/>
+      <w:r>
+        <w:t>login</w:t>
+      </w:r>
+      <w:proofErr w:type="spellEnd"/>
+      <w:r>
+        <w:t>. Admin memiliki seluruh hak akses petugas ditambah laporan, statistik, dan pengelolaan akun.</w:t>
+      </w:r>
+    </w:p>
+    <w:p>
+      <w:pPr>
+        <w:keepNext/>
+        <w:spacing w:after="60" w:line="276" w:lineRule="auto"/>
+        <w:jc w:val="center"/>
+      </w:pPr>
+      <w:r>
+        <w:rPr>
+          <w:noProof/>
+        </w:rPr>
+        <w:drawing>
+          <wp:inline distT="0" distB="0" distL="0" distR="0" wp14:anchorId="2D328677" wp14:editId="065D51AF">
+            <wp:extent cx="4572000" cy="4705350"/>
+            <wp:effectExtent l="0" t="0" r="0" b="0"/>
+            <wp:docPr id="2082436735" name="Use case" descr="Gambar 2. Use case diagram sistem antrian Posyandu" title="Use case"/>
+            <wp:cNvGraphicFramePr>
+              <a:graphicFrameLocks xmlns:a="http://schemas.openxmlformats.org/drawingml/2006/main" noChangeAspect="1"/>
+            </wp:cNvGraphicFramePr>
+            <a:graphic xmlns:a="http://schemas.openxmlformats.org/drawingml/2006/main">
+              <a:graphicData uri="http://schemas.openxmlformats.org/drawingml/2006/picture">
+                <pic:pic xmlns:pic="http://schemas.openxmlformats.org/drawingml/2006/picture">
+                  <pic:nvPicPr>
+                    <pic:cNvPr id="0" name=""/>
+                    <pic:cNvPicPr>
+                      <a:picLocks noChangeAspect="1" noChangeArrowheads="1"/>
+                    </pic:cNvPicPr>
+                  </pic:nvPicPr>
+                  <pic:blipFill>
+                    <a:blip r:embed="rId7"/>
+                    <a:srcRect/>
+                    <a:stretch>
+                      <a:fillRect/>
+                    </a:stretch>
+                  </pic:blipFill>
+                  <pic:spPr bwMode="auto">
+                    <a:xfrm>
+                      <a:off x="0" y="0"/>
+                      <a:ext cx="4572000" cy="4705350"/>
+                    </a:xfrm>
+                    <a:prstGeom prst="rect">
+                      <a:avLst/>
+                    </a:prstGeom>
+                  </pic:spPr>
+                </pic:pic>
+              </a:graphicData>
+            </a:graphic>
+          </wp:inline>
+        </w:drawing>
+      </w:r>
+    </w:p>
+    <w:p>
+      <w:pPr>
+        <w:spacing w:after="200" w:line="276" w:lineRule="auto"/>
+        <w:jc w:val="center"/>
+      </w:pPr>
+      <w:r>
+        <w:rPr>
+          <w:i/>
+          <w:iCs/>
+        </w:rPr>
+        <w:t xml:space="preserve">Gambar 2. Use </w:t>
+      </w:r>
+      <w:proofErr w:type="spellStart"/>
+      <w:r>
+        <w:rPr>
+          <w:i/>
+          <w:iCs/>
+        </w:rPr>
+        <w:t>case</w:t>
+      </w:r>
+      <w:proofErr w:type="spellEnd"/>
+      <w:r>
+        <w:rPr>
+          <w:i/>
+          <w:iCs/>
+        </w:rPr>
+        <w:t xml:space="preserve"> diagram sistem </w:t>
+      </w:r>
+      <w:proofErr w:type="spellStart"/>
+      <w:r>
+        <w:rPr>
+          <w:i/>
+          <w:iCs/>
+        </w:rPr>
         <w:t>antrian</w:t>
       </w:r>
       <w:proofErr w:type="spellEnd"/>
       <w:r>
-        <w:t xml:space="preserve">, dan data layar </w:t>
-      </w:r>
-      <w:proofErr w:type="spellStart"/>
-      <w:r>
-        <w:t>display</w:t>
-      </w:r>
-      <w:proofErr w:type="spellEnd"/>
-      <w:r>
-        <w:t>.</w:t>
-      </w:r>
-    </w:p>
-    <w:p>
-      <w:pPr>
+        <w:rPr>
+          <w:i/>
+          <w:iCs/>
+        </w:rPr>
+        <w:t xml:space="preserve"> Posyandu</w:t>
+      </w:r>
+    </w:p>
+    <w:p>
+      <w:pPr>
+        <w:pStyle w:val="ListParagraph"/>
         <w:numPr>
           <w:ilvl w:val="0"/>
-          <w:numId w:val="2"/>
+          <w:numId w:val="3"/>
         </w:numPr>
-        <w:spacing w:line="360" w:lineRule="auto"/>
+        <w:spacing w:after="80" w:line="276" w:lineRule="auto"/>
+        <w:contextualSpacing w:val="0"/>
         <w:jc w:val="both"/>
       </w:pPr>
       <w:r>
@@ -1051,44 +1180,463 @@
           <w:b/>
           <w:bCs/>
         </w:rPr>
-        <w:t xml:space="preserve">Pasien </w:t>
-      </w:r>
-      <w:proofErr w:type="spellStart"/>
-      <w:r>
-        <w:rPr>
-          <w:b/>
-          <w:bCs/>
-        </w:rPr>
-        <w:t>service</w:t>
-      </w:r>
-      <w:proofErr w:type="spellEnd"/>
-      <w:r>
-        <w:rPr>
-          <w:b/>
-          <w:bCs/>
-        </w:rPr>
-        <w:t xml:space="preserve">: </w:t>
-      </w:r>
-      <w:r>
-        <w:t>mengelola data balita, ibu hamil, kunjungan, serta statistik.</w:t>
-      </w:r>
-    </w:p>
-    <w:p>
-      <w:pPr>
+        <w:t xml:space="preserve">Pasien: </w:t>
+      </w:r>
+      <w:r>
+        <w:t xml:space="preserve">mengambil nomor </w:t>
+      </w:r>
+      <w:proofErr w:type="spellStart"/>
+      <w:r>
+        <w:t>antrian</w:t>
+      </w:r>
+      <w:proofErr w:type="spellEnd"/>
+      <w:r>
+        <w:t xml:space="preserve">, melihat status tiket, dan melihat layar </w:t>
+      </w:r>
+      <w:proofErr w:type="spellStart"/>
+      <w:r>
+        <w:t>display</w:t>
+      </w:r>
+      <w:proofErr w:type="spellEnd"/>
+      <w:r>
+        <w:t>.</w:t>
+      </w:r>
+    </w:p>
+    <w:p>
+      <w:pPr>
+        <w:pStyle w:val="ListParagraph"/>
         <w:numPr>
           <w:ilvl w:val="0"/>
-          <w:numId w:val="2"/>
+          <w:numId w:val="3"/>
         </w:numPr>
-        <w:spacing w:line="360" w:lineRule="auto"/>
+        <w:spacing w:after="80" w:line="276" w:lineRule="auto"/>
+        <w:contextualSpacing w:val="0"/>
         <w:jc w:val="both"/>
       </w:pPr>
-      <w:proofErr w:type="spellStart"/>
-      <w:r>
-        <w:rPr>
-          <w:b/>
-          <w:bCs/>
-        </w:rPr>
-        <w:t>Database</w:t>
+      <w:r>
+        <w:rPr>
+          <w:b/>
+          <w:bCs/>
+        </w:rPr>
+        <w:t xml:space="preserve">Petugas: </w:t>
+      </w:r>
+      <w:proofErr w:type="spellStart"/>
+      <w:r>
+        <w:t>login</w:t>
+      </w:r>
+      <w:proofErr w:type="spellEnd"/>
+      <w:r>
+        <w:t xml:space="preserve">, melihat daftar </w:t>
+      </w:r>
+      <w:proofErr w:type="spellStart"/>
+      <w:r>
+        <w:t>antrian</w:t>
+      </w:r>
+      <w:proofErr w:type="spellEnd"/>
+      <w:r>
+        <w:t xml:space="preserve">, memanggil, menyelesaikan atau membatalkan </w:t>
+      </w:r>
+      <w:proofErr w:type="spellStart"/>
+      <w:r>
+        <w:t>antrian</w:t>
+      </w:r>
+      <w:proofErr w:type="spellEnd"/>
+      <w:r>
+        <w:t>, dan melihat data pasien.</w:t>
+      </w:r>
+    </w:p>
+    <w:p>
+      <w:pPr>
+        <w:pStyle w:val="ListParagraph"/>
+        <w:numPr>
+          <w:ilvl w:val="0"/>
+          <w:numId w:val="3"/>
+        </w:numPr>
+        <w:spacing w:after="80" w:line="276" w:lineRule="auto"/>
+        <w:contextualSpacing w:val="0"/>
+        <w:jc w:val="both"/>
+      </w:pPr>
+      <w:r>
+        <w:rPr>
+          <w:b/>
+          <w:bCs/>
+        </w:rPr>
+        <w:t xml:space="preserve">Admin: </w:t>
+      </w:r>
+      <w:r>
+        <w:t>mewarisi seluruh fungsi petugas, serta melihat laporan dan statistik dan mengelola akun.</w:t>
+      </w:r>
+    </w:p>
+    <w:p>
+      <w:pPr>
+        <w:spacing w:line="276" w:lineRule="auto"/>
+      </w:pPr>
+      <w:r>
+        <w:br w:type="page"/>
+      </w:r>
+    </w:p>
+    <w:p>
+      <w:pPr>
+        <w:pStyle w:val="ListParagraph"/>
+        <w:keepNext/>
+        <w:numPr>
+          <w:ilvl w:val="0"/>
+          <w:numId w:val="4"/>
+        </w:numPr>
+        <w:spacing w:before="200" w:after="140" w:line="276" w:lineRule="auto"/>
+        <w:rPr>
+          <w:b/>
+          <w:bCs/>
+        </w:rPr>
+      </w:pPr>
+      <w:proofErr w:type="spellStart"/>
+      <w:r>
+        <w:rPr>
+          <w:b/>
+          <w:bCs/>
+        </w:rPr>
+        <w:lastRenderedPageBreak/>
+        <w:t>Entity</w:t>
+      </w:r>
+      <w:proofErr w:type="spellEnd"/>
+      <w:r>
+        <w:rPr>
+          <w:b/>
+          <w:bCs/>
+        </w:rPr>
+        <w:t xml:space="preserve"> R</w:t>
+      </w:r>
+      <w:proofErr w:type="spellStart"/>
+      <w:r>
+        <w:rPr>
+          <w:b/>
+          <w:bCs/>
+        </w:rPr>
+        <w:t>elationship</w:t>
+      </w:r>
+      <w:proofErr w:type="spellEnd"/>
+      <w:r>
+        <w:rPr>
+          <w:b/>
+          <w:bCs/>
+        </w:rPr>
+        <w:t xml:space="preserve"> Diagram (per Service)</w:t>
+      </w:r>
+    </w:p>
+    <w:p>
+      <w:pPr>
+        <w:pStyle w:val="ListParagraph"/>
+        <w:keepNext/>
+        <w:spacing w:before="200" w:after="140" w:line="276" w:lineRule="auto"/>
+        <w:ind w:left="360" w:firstLine="360"/>
+        <w:jc w:val="both"/>
+        <w:rPr>
+          <w:b/>
+          <w:bCs/>
+        </w:rPr>
+      </w:pPr>
+      <w:r>
+        <w:t xml:space="preserve">Setiap </w:t>
+      </w:r>
+      <w:proofErr w:type="spellStart"/>
+      <w:r>
+        <w:t>service</w:t>
+      </w:r>
+      <w:proofErr w:type="spellEnd"/>
+      <w:r>
+        <w:t xml:space="preserve"> memiliki basis data sendiri, sehingga tidak ada </w:t>
+      </w:r>
+      <w:proofErr w:type="spellStart"/>
+      <w:r>
+        <w:t>foreign</w:t>
+      </w:r>
+      <w:proofErr w:type="spellEnd"/>
+      <w:r>
+        <w:t xml:space="preserve"> </w:t>
+      </w:r>
+      <w:proofErr w:type="spellStart"/>
+      <w:r>
+        <w:t>key</w:t>
+      </w:r>
+      <w:proofErr w:type="spellEnd"/>
+      <w:r>
+        <w:t xml:space="preserve"> antar basis data. Hubungan lintas </w:t>
+      </w:r>
+      <w:proofErr w:type="spellStart"/>
+      <w:r>
+        <w:t>service</w:t>
+      </w:r>
+      <w:proofErr w:type="spellEnd"/>
+      <w:r>
+        <w:t xml:space="preserve"> hanya berupa referensi logis (</w:t>
+      </w:r>
+      <w:proofErr w:type="spellStart"/>
+      <w:r>
+        <w:t>id</w:t>
+      </w:r>
+      <w:proofErr w:type="spellEnd"/>
+      <w:r>
+        <w:t xml:space="preserve"> yang disimpan sebagai angka biasa), yaitu </w:t>
+      </w:r>
+      <w:proofErr w:type="spellStart"/>
+      <w:r>
+        <w:t>kunjungan.antrian_id</w:t>
+      </w:r>
+      <w:proofErr w:type="spellEnd"/>
+      <w:r>
+        <w:t xml:space="preserve"> dan </w:t>
+      </w:r>
+      <w:proofErr w:type="spellStart"/>
+      <w:r>
+        <w:t>antrian.ditangani_oleh</w:t>
+      </w:r>
+      <w:proofErr w:type="spellEnd"/>
+      <w:r>
+        <w:t>.</w:t>
+      </w:r>
+    </w:p>
+    <w:p>
+      <w:pPr>
+        <w:keepNext/>
+        <w:spacing w:after="60" w:line="276" w:lineRule="auto"/>
+        <w:jc w:val="center"/>
+      </w:pPr>
+      <w:r>
+        <w:rPr>
+          <w:noProof/>
+        </w:rPr>
+        <w:drawing>
+          <wp:inline distT="0" distB="0" distL="0" distR="0" wp14:anchorId="451360DE" wp14:editId="13780AA1">
+            <wp:extent cx="5524500" cy="1790700"/>
+            <wp:effectExtent l="0" t="0" r="0" b="0"/>
+            <wp:docPr id="967203981" name="ERD auth" descr="Gambar 3. ERD auth-service" title="ERD auth"/>
+            <wp:cNvGraphicFramePr>
+              <a:graphicFrameLocks xmlns:a="http://schemas.openxmlformats.org/drawingml/2006/main" noChangeAspect="1"/>
+            </wp:cNvGraphicFramePr>
+            <a:graphic xmlns:a="http://schemas.openxmlformats.org/drawingml/2006/main">
+              <a:graphicData uri="http://schemas.openxmlformats.org/drawingml/2006/picture">
+                <pic:pic xmlns:pic="http://schemas.openxmlformats.org/drawingml/2006/picture">
+                  <pic:nvPicPr>
+                    <pic:cNvPr id="0" name=""/>
+                    <pic:cNvPicPr>
+                      <a:picLocks noChangeAspect="1" noChangeArrowheads="1"/>
+                    </pic:cNvPicPr>
+                  </pic:nvPicPr>
+                  <pic:blipFill>
+                    <a:blip r:embed="rId8"/>
+                    <a:srcRect/>
+                    <a:stretch>
+                      <a:fillRect/>
+                    </a:stretch>
+                  </pic:blipFill>
+                  <pic:spPr bwMode="auto">
+                    <a:xfrm>
+                      <a:off x="0" y="0"/>
+                      <a:ext cx="5524500" cy="1790700"/>
+                    </a:xfrm>
+                    <a:prstGeom prst="rect">
+                      <a:avLst/>
+                    </a:prstGeom>
+                  </pic:spPr>
+                </pic:pic>
+              </a:graphicData>
+            </a:graphic>
+          </wp:inline>
+        </w:drawing>
+      </w:r>
+    </w:p>
+    <w:p>
+      <w:pPr>
+        <w:spacing w:after="200" w:line="276" w:lineRule="auto"/>
+        <w:jc w:val="center"/>
+      </w:pPr>
+      <w:r>
+        <w:rPr>
+          <w:i/>
+          <w:iCs/>
+        </w:rPr>
+        <w:t xml:space="preserve">Gambar 3. ERD </w:t>
+      </w:r>
+      <w:proofErr w:type="spellStart"/>
+      <w:r>
+        <w:rPr>
+          <w:i/>
+          <w:iCs/>
+        </w:rPr>
+        <w:t>auth-service</w:t>
+      </w:r>
+      <w:proofErr w:type="spellEnd"/>
+    </w:p>
+    <w:p>
+      <w:pPr>
+        <w:keepNext/>
+        <w:spacing w:after="60" w:line="276" w:lineRule="auto"/>
+        <w:jc w:val="center"/>
+      </w:pPr>
+      <w:r>
+        <w:rPr>
+          <w:noProof/>
+        </w:rPr>
+        <w:drawing>
+          <wp:inline distT="0" distB="0" distL="0" distR="0" wp14:anchorId="7F3C7E21" wp14:editId="4EBFA84E">
+            <wp:extent cx="5524500" cy="2438400"/>
+            <wp:effectExtent l="0" t="0" r="0" b="0"/>
+            <wp:docPr id="927198747" name="ERD antrian" descr="Gambar 4. ERD antrian-service" title="ERD antrian"/>
+            <wp:cNvGraphicFramePr>
+              <a:graphicFrameLocks xmlns:a="http://schemas.openxmlformats.org/drawingml/2006/main" noChangeAspect="1"/>
+            </wp:cNvGraphicFramePr>
+            <a:graphic xmlns:a="http://schemas.openxmlformats.org/drawingml/2006/main">
+              <a:graphicData uri="http://schemas.openxmlformats.org/drawingml/2006/picture">
+                <pic:pic xmlns:pic="http://schemas.openxmlformats.org/drawingml/2006/picture">
+                  <pic:nvPicPr>
+                    <pic:cNvPr id="0" name=""/>
+                    <pic:cNvPicPr>
+                      <a:picLocks noChangeAspect="1" noChangeArrowheads="1"/>
+                    </pic:cNvPicPr>
+                  </pic:nvPicPr>
+                  <pic:blipFill>
+                    <a:blip r:embed="rId9"/>
+                    <a:srcRect/>
+                    <a:stretch>
+                      <a:fillRect/>
+                    </a:stretch>
+                  </pic:blipFill>
+                  <pic:spPr bwMode="auto">
+                    <a:xfrm>
+                      <a:off x="0" y="0"/>
+                      <a:ext cx="5524500" cy="2438400"/>
+                    </a:xfrm>
+                    <a:prstGeom prst="rect">
+                      <a:avLst/>
+                    </a:prstGeom>
+                  </pic:spPr>
+                </pic:pic>
+              </a:graphicData>
+            </a:graphic>
+          </wp:inline>
+        </w:drawing>
+      </w:r>
+    </w:p>
+    <w:p>
+      <w:pPr>
+        <w:spacing w:after="200" w:line="276" w:lineRule="auto"/>
+        <w:jc w:val="center"/>
+      </w:pPr>
+      <w:r>
+        <w:rPr>
+          <w:i/>
+          <w:iCs/>
+        </w:rPr>
+        <w:t xml:space="preserve">Gambar 4. ERD </w:t>
+      </w:r>
+      <w:proofErr w:type="spellStart"/>
+      <w:r>
+        <w:rPr>
+          <w:i/>
+          <w:iCs/>
+        </w:rPr>
+        <w:t>antrian-service</w:t>
+      </w:r>
+      <w:proofErr w:type="spellEnd"/>
+    </w:p>
+    <w:p>
+      <w:pPr>
+        <w:keepNext/>
+        <w:spacing w:after="60" w:line="276" w:lineRule="auto"/>
+        <w:jc w:val="center"/>
+      </w:pPr>
+      <w:r>
+        <w:rPr>
+          <w:noProof/>
+        </w:rPr>
+        <w:lastRenderedPageBreak/>
+        <w:drawing>
+          <wp:inline distT="0" distB="0" distL="0" distR="0" wp14:anchorId="29A89CF7" wp14:editId="449A8766">
+            <wp:extent cx="5524500" cy="2762250"/>
+            <wp:effectExtent l="0" t="0" r="0" b="0"/>
+            <wp:docPr id="958802997" name="ERD pasien" descr="Gambar 5. ERD pasien-service" title="ERD pasien"/>
+            <wp:cNvGraphicFramePr>
+              <a:graphicFrameLocks xmlns:a="http://schemas.openxmlformats.org/drawingml/2006/main" noChangeAspect="1"/>
+            </wp:cNvGraphicFramePr>
+            <a:graphic xmlns:a="http://schemas.openxmlformats.org/drawingml/2006/main">
+              <a:graphicData uri="http://schemas.openxmlformats.org/drawingml/2006/picture">
+                <pic:pic xmlns:pic="http://schemas.openxmlformats.org/drawingml/2006/picture">
+                  <pic:nvPicPr>
+                    <pic:cNvPr id="0" name=""/>
+                    <pic:cNvPicPr>
+                      <a:picLocks noChangeAspect="1" noChangeArrowheads="1"/>
+                    </pic:cNvPicPr>
+                  </pic:nvPicPr>
+                  <pic:blipFill>
+                    <a:blip r:embed="rId10"/>
+                    <a:srcRect/>
+                    <a:stretch>
+                      <a:fillRect/>
+                    </a:stretch>
+                  </pic:blipFill>
+                  <pic:spPr bwMode="auto">
+                    <a:xfrm>
+                      <a:off x="0" y="0"/>
+                      <a:ext cx="5524500" cy="2762250"/>
+                    </a:xfrm>
+                    <a:prstGeom prst="rect">
+                      <a:avLst/>
+                    </a:prstGeom>
+                  </pic:spPr>
+                </pic:pic>
+              </a:graphicData>
+            </a:graphic>
+          </wp:inline>
+        </w:drawing>
+      </w:r>
+    </w:p>
+    <w:p>
+      <w:pPr>
+        <w:spacing w:after="200" w:line="276" w:lineRule="auto"/>
+        <w:jc w:val="center"/>
+      </w:pPr>
+      <w:r>
+        <w:rPr>
+          <w:i/>
+          <w:iCs/>
+        </w:rPr>
+        <w:t>Gambar 5. ERD pasien-</w:t>
+      </w:r>
+      <w:proofErr w:type="spellStart"/>
+      <w:r>
+        <w:rPr>
+          <w:i/>
+          <w:iCs/>
+        </w:rPr>
+        <w:t>service</w:t>
+      </w:r>
+      <w:proofErr w:type="spellEnd"/>
+    </w:p>
+    <w:p>
+      <w:pPr>
+        <w:pStyle w:val="ListParagraph"/>
+        <w:numPr>
+          <w:ilvl w:val="0"/>
+          <w:numId w:val="3"/>
+        </w:numPr>
+        <w:spacing w:after="80" w:line="276" w:lineRule="auto"/>
+        <w:contextualSpacing w:val="0"/>
+        <w:jc w:val="both"/>
+      </w:pPr>
+      <w:r>
+        <w:rPr>
+          <w:b/>
+          <w:bCs/>
+        </w:rPr>
+        <w:t xml:space="preserve">Nomor </w:t>
+      </w:r>
+      <w:proofErr w:type="spellStart"/>
+      <w:r>
+        <w:rPr>
+          <w:b/>
+          <w:bCs/>
+        </w:rPr>
+        <w:t>antrian</w:t>
       </w:r>
       <w:proofErr w:type="spellEnd"/>
       <w:r>
@@ -1099,7 +1647,138 @@
         <w:t xml:space="preserve">: </w:t>
       </w:r>
       <w:r>
-        <w:t xml:space="preserve">setiap </w:t>
+        <w:t>unik per layanan per hari (</w:t>
+      </w:r>
+      <w:proofErr w:type="spellStart"/>
+      <w:r>
+        <w:t>layanan_id</w:t>
+      </w:r>
+      <w:proofErr w:type="spellEnd"/>
+      <w:r>
+        <w:t>, tanggal, nomor), sehingga dua pasien tidak mungkin mendapat nomor yang sama.</w:t>
+      </w:r>
+    </w:p>
+    <w:p>
+      <w:pPr>
+        <w:pStyle w:val="ListParagraph"/>
+        <w:numPr>
+          <w:ilvl w:val="0"/>
+          <w:numId w:val="3"/>
+        </w:numPr>
+        <w:spacing w:after="80" w:line="276" w:lineRule="auto"/>
+        <w:contextualSpacing w:val="0"/>
+        <w:jc w:val="both"/>
+      </w:pPr>
+      <w:r>
+        <w:rPr>
+          <w:b/>
+          <w:bCs/>
+        </w:rPr>
+        <w:t xml:space="preserve">Kunjungan: </w:t>
+      </w:r>
+      <w:r>
+        <w:t xml:space="preserve">memiliki </w:t>
+      </w:r>
+      <w:proofErr w:type="spellStart"/>
+      <w:r>
+        <w:t>antrian_id</w:t>
+      </w:r>
+      <w:proofErr w:type="spellEnd"/>
+      <w:r>
+        <w:t xml:space="preserve"> yang unik, sehingga pengiriman ulang dari </w:t>
+      </w:r>
+      <w:proofErr w:type="spellStart"/>
+      <w:r>
+        <w:t>antrian-service</w:t>
+      </w:r>
+      <w:proofErr w:type="spellEnd"/>
+      <w:r>
+        <w:t xml:space="preserve"> tidak membuat data ganda.</w:t>
+      </w:r>
+    </w:p>
+    <w:p>
+      <w:pPr>
+        <w:spacing w:line="276" w:lineRule="auto"/>
+      </w:pPr>
+      <w:r>
+        <w:br w:type="page"/>
+      </w:r>
+    </w:p>
+    <w:p>
+      <w:pPr>
+        <w:pStyle w:val="ListParagraph"/>
+        <w:keepNext/>
+        <w:numPr>
+          <w:ilvl w:val="0"/>
+          <w:numId w:val="4"/>
+        </w:numPr>
+        <w:spacing w:before="200" w:after="140" w:line="276" w:lineRule="auto"/>
+        <w:rPr>
+          <w:b/>
+          <w:bCs/>
+        </w:rPr>
+      </w:pPr>
+      <w:proofErr w:type="spellStart"/>
+      <w:r>
+        <w:rPr>
+          <w:b/>
+          <w:bCs/>
+        </w:rPr>
+        <w:lastRenderedPageBreak/>
+        <w:t>Sequence</w:t>
+      </w:r>
+      <w:proofErr w:type="spellEnd"/>
+      <w:r>
+        <w:rPr>
+          <w:b/>
+          <w:bCs/>
+        </w:rPr>
+        <w:t xml:space="preserve"> Diagram: Pengambilan Nomor </w:t>
+      </w:r>
+      <w:proofErr w:type="spellStart"/>
+      <w:r>
+        <w:rPr>
+          <w:b/>
+          <w:bCs/>
+        </w:rPr>
+        <w:t>Antrian</w:t>
+      </w:r>
+      <w:proofErr w:type="spellEnd"/>
+    </w:p>
+    <w:p>
+      <w:pPr>
+        <w:pStyle w:val="ListParagraph"/>
+        <w:keepNext/>
+        <w:spacing w:before="200" w:after="140" w:line="276" w:lineRule="auto"/>
+        <w:ind w:left="360" w:firstLine="360"/>
+        <w:jc w:val="both"/>
+      </w:pPr>
+      <w:r>
+        <w:t xml:space="preserve">Alur normal: pasien mengisi </w:t>
+      </w:r>
+      <w:proofErr w:type="spellStart"/>
+      <w:r>
+        <w:t>form</w:t>
+      </w:r>
+      <w:proofErr w:type="spellEnd"/>
+      <w:r>
+        <w:t xml:space="preserve">, permintaan melewati </w:t>
+      </w:r>
+      <w:proofErr w:type="spellStart"/>
+      <w:r>
+        <w:t>gateway</w:t>
+      </w:r>
+      <w:proofErr w:type="spellEnd"/>
+      <w:r>
+        <w:t xml:space="preserve"> ke </w:t>
+      </w:r>
+      <w:proofErr w:type="spellStart"/>
+      <w:r>
+        <w:t>antrian-service</w:t>
+      </w:r>
+      <w:proofErr w:type="spellEnd"/>
+      <w:r>
+        <w:t>, nomor dibuat dan disimpan, lalu data kunjungan dikirim ke pasien-</w:t>
       </w:r>
       <w:proofErr w:type="spellStart"/>
       <w:r>
@@ -1107,8 +1786,120 @@
       </w:r>
       <w:proofErr w:type="spellEnd"/>
       <w:r>
-        <w:t xml:space="preserve"> memiliki basis data sendiri.</w:t>
-      </w:r>
+        <w:t>. Jika pasien-</w:t>
+      </w:r>
+      <w:proofErr w:type="spellStart"/>
+      <w:r>
+        <w:t>service</w:t>
+      </w:r>
+      <w:proofErr w:type="spellEnd"/>
+      <w:r>
+        <w:t xml:space="preserve"> tidak merespons, pasien tetap mendapat nomor. </w:t>
+      </w:r>
+      <w:proofErr w:type="spellStart"/>
+      <w:r>
+        <w:t>Antrian</w:t>
+      </w:r>
+      <w:proofErr w:type="spellEnd"/>
+      <w:r>
+        <w:t xml:space="preserve"> ditandai belum sinkron dan dikirim ulang otomatis secara berkala. Pengiriman ulang aman karena bersifat </w:t>
+      </w:r>
+      <w:proofErr w:type="spellStart"/>
+      <w:r>
+        <w:t>idempoten</w:t>
+      </w:r>
+      <w:proofErr w:type="spellEnd"/>
+      <w:r>
+        <w:t>.</w:t>
+      </w:r>
+    </w:p>
+    <w:p>
+      <w:pPr>
+        <w:keepNext/>
+        <w:spacing w:after="60" w:line="276" w:lineRule="auto"/>
+        <w:jc w:val="center"/>
+      </w:pPr>
+      <w:r>
+        <w:rPr>
+          <w:noProof/>
+        </w:rPr>
+        <w:drawing>
+          <wp:inline distT="0" distB="0" distL="0" distR="0" wp14:anchorId="77491B75" wp14:editId="4AAF5BAD">
+            <wp:extent cx="4476750" cy="5467350"/>
+            <wp:effectExtent l="0" t="0" r="0" b="0"/>
+            <wp:docPr id="279708526" name="Sequence" descr="Gambar 6. Sequence diagram pengambilan nomor antrian" title="Sequence"/>
+            <wp:cNvGraphicFramePr>
+              <a:graphicFrameLocks xmlns:a="http://schemas.openxmlformats.org/drawingml/2006/main" noChangeAspect="1"/>
+            </wp:cNvGraphicFramePr>
+            <a:graphic xmlns:a="http://schemas.openxmlformats.org/drawingml/2006/main">
+              <a:graphicData uri="http://schemas.openxmlformats.org/drawingml/2006/picture">
+                <pic:pic xmlns:pic="http://schemas.openxmlformats.org/drawingml/2006/picture">
+                  <pic:nvPicPr>
+                    <pic:cNvPr id="0" name=""/>
+                    <pic:cNvPicPr>
+                      <a:picLocks noChangeAspect="1" noChangeArrowheads="1"/>
+                    </pic:cNvPicPr>
+                  </pic:nvPicPr>
+                  <pic:blipFill>
+                    <a:blip r:embed="rId11"/>
+                    <a:srcRect/>
+                    <a:stretch>
+                      <a:fillRect/>
+                    </a:stretch>
+                  </pic:blipFill>
+                  <pic:spPr bwMode="auto">
+                    <a:xfrm>
+                      <a:off x="0" y="0"/>
+                      <a:ext cx="4476750" cy="5467350"/>
+                    </a:xfrm>
+                    <a:prstGeom prst="rect">
+                      <a:avLst/>
+                    </a:prstGeom>
+                  </pic:spPr>
+                </pic:pic>
+              </a:graphicData>
+            </a:graphic>
+          </wp:inline>
+        </w:drawing>
+      </w:r>
+    </w:p>
+    <w:p>
+      <w:pPr>
+        <w:spacing w:after="200" w:line="276" w:lineRule="auto"/>
+        <w:jc w:val="center"/>
+      </w:pPr>
+      <w:r>
+        <w:rPr>
+          <w:i/>
+          <w:iCs/>
+        </w:rPr>
+        <w:t xml:space="preserve">Gambar 6. </w:t>
+      </w:r>
+      <w:proofErr w:type="spellStart"/>
+      <w:r>
+        <w:rPr>
+          <w:i/>
+          <w:iCs/>
+        </w:rPr>
+        <w:t>Sequence</w:t>
+      </w:r>
+      <w:proofErr w:type="spellEnd"/>
+      <w:r>
+        <w:rPr>
+          <w:i/>
+          <w:iCs/>
+        </w:rPr>
+        <w:t xml:space="preserve"> diagram pengambilan nomor </w:t>
+      </w:r>
+      <w:proofErr w:type="spellStart"/>
+      <w:r>
+        <w:rPr>
+          <w:i/>
+          <w:iCs/>
+        </w:rPr>
+        <w:t>antrian</w:t>
+      </w:r>
+      <w:proofErr w:type="spellEnd"/>
     </w:p>
     <w:p>
       <w:pPr>
@@ -1129,6 +1920,92 @@
 <file path=word/numbering.xml><?xml version="1.0" encoding="utf-8"?>
 <w:numbering xmlns:wpc="http://schemas.microsoft.com/office/word/2010/wordprocessingCanvas" xmlns:cx="http://schemas.microsoft.com/office/drawing/2014/chartex" xmlns:cx1="http://schemas.microsoft.com/office/drawing/2015/9/8/chartex" xmlns:cx2="http://schemas.microsoft.com/office/drawing/2015/10/21/chartex" xmlns:cx3="http://schemas.microsoft.com/office/drawing/2016/5/9/chartex" xmlns:cx4="http://schemas.microsoft.com/office/drawing/2016/5/10/chartex" xmlns:cx5="http://schemas.microsoft.com/office/drawing/2016/5/11/chartex" xmlns:cx6="http://schemas.microsoft.com/office/drawing/2016/5/12/chartex" xmlns:cx7="http://schemas.microsoft.com/office/drawing/2016/5/13/chartex" xmlns:cx8="http://schemas.microsoft.com/office/drawing/2016/5/14/chartex" xmlns:mc="http://schemas.openxmlformats.org/markup-compatibility/2006" xmlns:aink="http://schemas.microsoft.com/office/drawing/2016/ink" xmlns:am3d="http://schemas.microsoft.com/office/drawing/2017/model3d" xmlns:o="urn:schemas-microsoft-com:office:office" xmlns:oel="http://schemas.microsoft.com/office/2019/extlst" xmlns:r="http://schemas.openxmlformats.org/officeDocument/2006/relationships" xmlns:m="http://schemas.openxmlformats.org/officeDocument/2006/math" xmlns:v="urn:schemas-microsoft-com:vml" xmlns:wp14="http://schemas.microsoft.com/office/word/2010/wordprocessingDrawing" xmlns:wp="http://schemas.openxmlformats.org/drawingml/2006/wordprocessingDrawing" xmlns:w10="urn:schemas-microsoft-com:office:word" xmlns:w="http://schemas.openxmlformats.org/wordprocessingml/2006/main" xmlns:w14="http://schemas.microsoft.com/office/word/2010/wordml" xmlns:w15="http://schemas.microsoft.com/office/word/2012/wordml" xmlns:w16cex="http://schemas.microsoft.com/office/word/2018/wordml/cex" xmlns:w16cid="http://schemas.microsoft.com/office/word/2016/wordml/cid" xmlns:w16="http://schemas.microsoft.com/office/word/2018/wordml" xmlns:w16du="http://schemas.microsoft.com/office/word/2023/wordml/word16du" xmlns:w16sdtdh="http://schemas.microsoft.com/office/word/2020/wordml/sdtdatahash" xmlns:w16sdtfl="http://schemas.microsoft.com/office/word/2024/wordml/sdtformatlock" xmlns:w16se="http://schemas.microsoft.com/office/word/2015/wordml/symex" xmlns:wpg="http://schemas.microsoft.com/office/word/2010/wordprocessingGroup" xmlns:wpi="http://schemas.microsoft.com/office/word/2010/wordprocessingInk" xmlns:wne="http://schemas.microsoft.com/office/word/2006/wordml" xmlns:wps="http://schemas.microsoft.com/office/word/2010/wordprocessingShape" mc:Ignorable="w14 w15 w16se w16cid w16 w16cex w16sdtdh w16sdtfl w16du wp14">
   <w:abstractNum w:abstractNumId="0" w15:restartNumberingAfterBreak="0">
+    <w:nsid w:val="53F94F0F"/>
+    <w:multiLevelType w:val="hybridMultilevel"/>
+    <w:tmpl w:val="20501068"/>
+    <w:lvl w:ilvl="0" w:tplc="0421000F">
+      <w:start w:val="1"/>
+      <w:numFmt w:val="decimal"/>
+      <w:lvlText w:val="%1."/>
+      <w:lvlJc w:val="left"/>
+      <w:pPr>
+        <w:ind w:left="360" w:hanging="360"/>
+      </w:pPr>
+    </w:lvl>
+    <w:lvl w:ilvl="1" w:tplc="04210019" w:tentative="1">
+      <w:start w:val="1"/>
+      <w:numFmt w:val="lowerLetter"/>
+      <w:lvlText w:val="%2."/>
+      <w:lvlJc w:val="left"/>
+      <w:pPr>
+        <w:ind w:left="1080" w:hanging="360"/>
+      </w:pPr>
+    </w:lvl>
+    <w:lvl w:ilvl="2" w:tplc="0421001B" w:tentative="1">
+      <w:start w:val="1"/>
+      <w:numFmt w:val="lowerRoman"/>
+      <w:lvlText w:val="%3."/>
+      <w:lvlJc w:val="right"/>
+      <w:pPr>
+        <w:ind w:left="1800" w:hanging="180"/>
+      </w:pPr>
+    </w:lvl>
+    <w:lvl w:ilvl="3" w:tplc="0421000F" w:tentative="1">
+      <w:start w:val="1"/>
+      <w:numFmt w:val="decimal"/>
+      <w:lvlText w:val="%4."/>
+      <w:lvlJc w:val="left"/>
+      <w:pPr>
+        <w:ind w:left="2520" w:hanging="360"/>
+      </w:pPr>
+    </w:lvl>
+    <w:lvl w:ilvl="4" w:tplc="04210019" w:tentative="1">
+      <w:start w:val="1"/>
+      <w:numFmt w:val="lowerLetter"/>
+      <w:lvlText w:val="%5."/>
+      <w:lvlJc w:val="left"/>
+      <w:pPr>
+        <w:ind w:left="3240" w:hanging="360"/>
+      </w:pPr>
+    </w:lvl>
+    <w:lvl w:ilvl="5" w:tplc="0421001B" w:tentative="1">
+      <w:start w:val="1"/>
+      <w:numFmt w:val="lowerRoman"/>
+      <w:lvlText w:val="%6."/>
+      <w:lvlJc w:val="right"/>
+      <w:pPr>
+        <w:ind w:left="3960" w:hanging="180"/>
+      </w:pPr>
+    </w:lvl>
+    <w:lvl w:ilvl="6" w:tplc="0421000F" w:tentative="1">
+      <w:start w:val="1"/>
+      <w:numFmt w:val="decimal"/>
+      <w:lvlText w:val="%7."/>
+      <w:lvlJc w:val="left"/>
+      <w:pPr>
+        <w:ind w:left="4680" w:hanging="360"/>
+      </w:pPr>
+    </w:lvl>
+    <w:lvl w:ilvl="7" w:tplc="04210019" w:tentative="1">
+      <w:start w:val="1"/>
+      <w:numFmt w:val="lowerLetter"/>
+      <w:lvlText w:val="%8."/>
+      <w:lvlJc w:val="left"/>
+      <w:pPr>
+        <w:ind w:left="5400" w:hanging="360"/>
+      </w:pPr>
+    </w:lvl>
+    <w:lvl w:ilvl="8" w:tplc="0421001B" w:tentative="1">
+      <w:start w:val="1"/>
+      <w:numFmt w:val="lowerRoman"/>
+      <w:lvlText w:val="%9."/>
+      <w:lvlJc w:val="right"/>
+      <w:pPr>
+        <w:ind w:left="6120" w:hanging="180"/>
+      </w:pPr>
+    </w:lvl>
+  </w:abstractNum>
+  <w:abstractNum w:abstractNumId="1" w15:restartNumberingAfterBreak="0">
     <w:nsid w:val="6D7321D7"/>
     <w:multiLevelType w:val="hybridMultilevel"/>
     <w:tmpl w:val="E0B8888C"/>
@@ -1214,7 +2091,7 @@
       </w:pPr>
     </w:lvl>
   </w:abstractNum>
-  <w:abstractNum w:abstractNumId="1" w15:restartNumberingAfterBreak="0">
+  <w:abstractNum w:abstractNumId="2" w15:restartNumberingAfterBreak="0">
     <w:nsid w:val="6F712452"/>
     <w:multiLevelType w:val="hybridMultilevel"/>
     <w:tmpl w:val="0DF49CEE"/>
@@ -1268,14 +2145,77 @@
       <w:lvlJc w:val="left"/>
     </w:lvl>
   </w:abstractNum>
+  <w:abstractNum w:abstractNumId="3" w15:restartNumberingAfterBreak="0">
+    <w:nsid w:val="78576DEB"/>
+    <w:multiLevelType w:val="hybridMultilevel"/>
+    <w:tmpl w:val="2A264D5C"/>
+    <w:lvl w:ilvl="0" w:tplc="5A865084">
+      <w:start w:val="1"/>
+      <w:numFmt w:val="bullet"/>
+      <w:lvlText w:val="•"/>
+      <w:lvlJc w:val="left"/>
+      <w:pPr>
+        <w:ind w:left="720" w:hanging="360"/>
+      </w:pPr>
+    </w:lvl>
+    <w:lvl w:ilvl="1" w:tplc="45346A8E">
+      <w:numFmt w:val="decimal"/>
+      <w:lvlText w:val=""/>
+      <w:lvlJc w:val="left"/>
+    </w:lvl>
+    <w:lvl w:ilvl="2" w:tplc="21CCFBE0">
+      <w:numFmt w:val="decimal"/>
+      <w:lvlText w:val=""/>
+      <w:lvlJc w:val="left"/>
+    </w:lvl>
+    <w:lvl w:ilvl="3" w:tplc="47FE36F4">
+      <w:numFmt w:val="decimal"/>
+      <w:lvlText w:val=""/>
+      <w:lvlJc w:val="left"/>
+    </w:lvl>
+    <w:lvl w:ilvl="4" w:tplc="A68E1FAE">
+      <w:numFmt w:val="decimal"/>
+      <w:lvlText w:val=""/>
+      <w:lvlJc w:val="left"/>
+    </w:lvl>
+    <w:lvl w:ilvl="5" w:tplc="B790A290">
+      <w:numFmt w:val="decimal"/>
+      <w:lvlText w:val=""/>
+      <w:lvlJc w:val="left"/>
+    </w:lvl>
+    <w:lvl w:ilvl="6" w:tplc="E06C4958">
+      <w:numFmt w:val="decimal"/>
+      <w:lvlText w:val=""/>
+      <w:lvlJc w:val="left"/>
+    </w:lvl>
+    <w:lvl w:ilvl="7" w:tplc="099E77C0">
+      <w:numFmt w:val="decimal"/>
+      <w:lvlText w:val=""/>
+      <w:lvlJc w:val="left"/>
+    </w:lvl>
+    <w:lvl w:ilvl="8" w:tplc="7ED650BC">
+      <w:numFmt w:val="decimal"/>
+      <w:lvlText w:val=""/>
+      <w:lvlJc w:val="left"/>
+    </w:lvl>
+  </w:abstractNum>
   <w:num w:numId="1" w16cid:durableId="786585605">
-    <w:abstractNumId w:val="0"/>
+    <w:abstractNumId w:val="1"/>
   </w:num>
   <w:num w:numId="2" w16cid:durableId="1064526107">
-    <w:abstractNumId w:val="1"/>
+    <w:abstractNumId w:val="2"/>
     <w:lvlOverride w:ilvl="0">
       <w:startOverride w:val="1"/>
     </w:lvlOverride>
+  </w:num>
+  <w:num w:numId="3" w16cid:durableId="959187415">
+    <w:abstractNumId w:val="3"/>
+    <w:lvlOverride w:ilvl="0">
+      <w:startOverride w:val="1"/>
+    </w:lvlOverride>
+  </w:num>
+  <w:num w:numId="4" w16cid:durableId="431972613">
+    <w:abstractNumId w:val="0"/>
   </w:num>
 </w:numbering>
 </file>
@@ -1478,7 +2418,7 @@
     <w:lsdException w:name="Medium Shading 2 Accent 1" w:uiPriority="64"/>
     <w:lsdException w:name="Medium List 1 Accent 1" w:uiPriority="65"/>
     <w:lsdException w:name="Revision" w:semiHidden="1"/>
-    <w:lsdException w:name="List Paragraph" w:uiPriority="34" w:qFormat="1"/>
+    <w:lsdException w:name="List Paragraph" w:uiPriority="0" w:qFormat="1"/>
     <w:lsdException w:name="Quote" w:uiPriority="29" w:qFormat="1"/>
     <w:lsdException w:name="Intense Quote" w:uiPriority="30" w:qFormat="1"/>
     <w:lsdException w:name="Medium List 2 Accent 1" w:uiPriority="66"/>
@@ -1891,6 +2831,7 @@
   <w:style w:type="character" w:default="1" w:styleId="DefaultParagraphFont">
     <w:name w:val="Default Paragraph Font"/>
     <w:uiPriority w:val="1"/>
+    <w:semiHidden/>
     <w:unhideWhenUsed/>
   </w:style>
   <w:style w:type="table" w:default="1" w:styleId="TableNormal">
@@ -2135,7 +3076,6 @@
   <w:style w:type="paragraph" w:styleId="ListParagraph">
     <w:name w:val="List Paragraph"/>
     <w:basedOn w:val="Normal"/>
-    <w:uiPriority w:val="34"/>
     <w:qFormat/>
     <w:rsid w:val="000C605B"/>
     <w:pPr>

</xml_diff>